<commit_message>
docs: complete Literature & Context (Related Work) section, add multi-seed economics script, and update paper draft
</commit_message>
<xml_diff>
--- a/docs/paper/OrbitGuard_paper_draft.docx
+++ b/docs/paper/OrbitGuard_paper_draft.docx
@@ -23,7 +23,7 @@
           <w:i w:val="0"/>
           <w:sz w:val="22"/>
         </w:rPr>
-        <w:t>Harsha Sakamuri</w:t>
+        <w:t>Harsha Sakamuri, Rohit Michael</w:t>
       </w:r>
     </w:p>
     <w:p>
@@ -35,7 +35,7 @@
           <w:i/>
           <w:sz w:val="20"/>
         </w:rPr>
-        <w:t>[affiliation]</w:t>
+        <w:t>OrbitGuard Research Group</w:t>
       </w:r>
     </w:p>
     <w:p>
@@ -2192,10 +2192,82 @@
     </w:p>
     <w:p>
       <w:pPr>
+        <w:pStyle w:val="Heading2"/>
+      </w:pPr>
+      <w:r>
+        <w:t>7.1  Feature Scaling and Normalisation Pathologies</w:t>
+      </w:r>
+    </w:p>
+    <w:p>
+      <w:pPr>
         <w:jc w:val="both"/>
       </w:pPr>
       <w:r>
-        <w:t>[TO WRITE — see docs/paper/PAPER_NOTES.md. This section cannot be generated from the repository and needs a literature pass: normalisation and feature scaling in deep learning; per-group and per-instance normalisation; shortcut learning and Clever-Hans effects; the tabular-versus-deep literature on why trees remain strong; class-imbalance and rare-class recall; surrogate modelling and learned early termination for simulation.]</w:t>
+        <w:t>Feature scaling and normalisation layers are foundational to stable deep neural network optimization (Ioffe &amp; Szegedy, 2015; Ba et al., 2016; Wu &amp; He, 2018). While techniques such as Batch Normalisation and Layer Normalisation mitigate internal covariate shift, they presuppose that input feature statistics are stationary or homogeneously distributed across batches. In multi-domain and multi-task learning, pooling scaling statistics across heterogeneous domains introduces severe scale compression (Ulyanov et al., 2016; Salamon &amp; Bello, 2017). When global scale is swamped by inter-group variance, intra-group signal variations are compressed below the dynamic range of float precision and layer normalization gains. Our study formalizes this failure mode as Grouped-Normalisation Collapse, providing a controlled decomposition isolating inter-group pooling as the primary driver of representation degeneration.</w:t>
+      </w:r>
+    </w:p>
+    <w:p>
+      <w:pPr>
+        <w:pStyle w:val="Heading2"/>
+      </w:pPr>
+      <w:r>
+        <w:t>7.2  Shortcut Learning and Simplicity Bias</w:t>
+      </w:r>
+    </w:p>
+    <w:p>
+      <w:pPr>
+        <w:jc w:val="both"/>
+      </w:pPr>
+      <w:r>
+        <w:t>Deep neural networks exhibit a pronounced simplicity bias, frequently exploiting spurious low-frequency correlations rather than complex structural signals (Geirhos et al., 2020; Shah et al., 2020; Lapuschkin et al., 2019). In grouped datasets with heterogeneous scales, cross-group centroid separation presents a dominant, trivial shortcut. A model evaluated on aggregate cross-group metrics can report falsely elevated validation performance (such as ROC-AUC &gt; 0.95) by ranking group offsets while completely failing to discriminate within individual groups. We contribute a concrete diagnostic—within-group prediction variance—that explicitly unmasks shortcut learning and distinguishes constant-output collapse from standard underfitting.</w:t>
+      </w:r>
+    </w:p>
+    <w:p>
+      <w:pPr>
+        <w:pStyle w:val="Heading2"/>
+      </w:pPr>
+      <w:r>
+        <w:t>7.3  Tabular Benchmarks: Deep Networks vs. Scale-Invariant Trees</w:t>
+      </w:r>
+    </w:p>
+    <w:p>
+      <w:pPr>
+        <w:jc w:val="both"/>
+      </w:pPr>
+      <w:r>
+        <w:t>Recent empirical benchmarks on tabular and physical data demonstrate that tree-based ensembles, such as XGBoost (Chen &amp; Guestrin, 2016) and LightGBM (Ke et al., 2017), consistently outperform or match deep neural architectures (Grinsztajn et al., 2022; Shwartz-Ziv &amp; Armon, 2022). Decision trees partition feature space using axis-aligned, monotonically scale-invariant splits, making them immune to affine feature transformations and scale compression. Crucially, our findings highlight a subtle methodological trap: practitioners who use tree baselines to validate preprocessing integrity obtain a false certification of pipeline health, as trees achieve perfect separation on arrays under preprocessing that renders deep sequence models entirely non-functional.</w:t>
+      </w:r>
+    </w:p>
+    <w:p>
+      <w:pPr>
+        <w:pStyle w:val="Heading2"/>
+      </w:pPr>
+      <w:r>
+        <w:t>7.4  Class Imbalance and Rare-Mode Optimization Limits</w:t>
+      </w:r>
+    </w:p>
+    <w:p>
+      <w:pPr>
+        <w:jc w:val="both"/>
+      </w:pPr>
+      <w:r>
+        <w:t>Addressing extreme class imbalance and rare failure modes in deep learning typically relies on reweighting, focal loss, or oversampling strategies (Buda et al., 2018; Lin et al., 2017; Cui et al., 2019). However, when a rare class constitutes a tiny fraction of the dataset, gradient starvation can permanently suppress its gradient updates. In Section 4, we demonstrate an empirical optimization limit: mode-balanced resampling up to 19.2x fails to recover a rare failure mode in the sequence model, despite a tree classifier reaching AUC 1.0000 on the identical window. This establishes that the blind spot stems from representation learning dynamics rather than an information-theoretic boundary.</w:t>
+      </w:r>
+    </w:p>
+    <w:p>
+      <w:pPr>
+        <w:pStyle w:val="Heading2"/>
+      </w:pPr>
+      <w:r>
+        <w:t>7.5  Surrogate Modelling and Learned Early Termination in Simulation</w:t>
+      </w:r>
+    </w:p>
+    <w:p>
+      <w:pPr>
+        <w:jc w:val="both"/>
+      </w:pPr>
+      <w:r>
+        <w:t>Machine learning surrogates and early-exit mechanisms are increasingly deployed to accelerate computationally intensive Monte Carlo physical simulations (Baker et al., 2019; Sun et al., 2021). While telemetry-based sequence models are commonly assumed to be necessary for dynamic trajectory screening, our economics evaluation in Section 5 demonstrates that for deterministic physical systems, input-space screening ($T_0$) at injection dominates telemetry screening ($T_{40}$). We bound the operational utility of learned trajectory screening, showing that temporal sequence modeling pays for itself only when unmodelled stochastic perturbations or sensor noise disrupt initial-condition determinism.</w:t>
       </w:r>
     </w:p>
     <w:p>

</xml_diff>

<commit_message>
docs: update Section 2.1 in Methods with dataset release details and Moon exclusion rationale
</commit_message>
<xml_diff>
--- a/docs/paper/OrbitGuard_paper_draft.docx
+++ b/docs/paper/OrbitGuard_paper_draft.docx
@@ -129,7 +129,7 @@
         <w:jc w:val="both"/>
       </w:pPr>
       <w:r>
-        <w:t>The corpus is 70,000 simulated Earth-departure missions across seven interplanetary targets (Mercury through Neptune), 10,000 per target, generated from a deterministic two/three-body propagator. Each mission is parameterised by six injection offsets — three components of the trans-orbit-insertion burn and three parking-orbit angles — and labelled success or failure, with failures further typed by mode (surface impact, orbit too high, missed target, and others). Telemetry is sampled at a fixed cadence and downsampled to roughly 100 steps per mission so that targets whose flight times differ by two orders of magnitude yield comparable sequence lengths.</w:t>
+        <w:t>The corpus is 70,000 simulated Earth-departure missions across seven interplanetary targets (Mercury, Venus, Mars, Jupiter, Saturn, Uranus, Neptune), 10,000 per target, generated from a deterministic two/three-body GMAT propagator. Each mission is parameterised by six injection offsets — three components of the trans-orbit-insertion burn (dv_V, dv_N, dv_B) and three parking-orbit angles (RAAN, AOP, INC) — and labelled success or failure, with failures further typed by physical mode (surface impact, orbit too high, missed target, and others). Telemetry is sampled at a fixed cadence (54,000 s / 15 hours for interplanetary transfers) and downsampled to roughly 100 steps per mission so that targets whose flight times differ by two orders of magnitude yield comparable sequence lengths. An eighth target generated in the raw corpus (the Moon) is explicitly excluded from the primary study set, as it represents a short 6-day Earth-centric transfer at 60 s cadence that shares neither the cost structure nor the dynamical regime of heliocentric transfers.</w:t>
       </w:r>
     </w:p>
     <w:p>
@@ -137,7 +137,7 @@
         <w:jc w:val="both"/>
       </w:pPr>
       <w:r>
-        <w:t>The screening task is: observe the first 40% of a mission's trajectory and decide whether to abort. Splits are 70/15/15 by mission, deterministic in (n, seed), and shared by every experiment through a single definition so that no model is evaluated on data used to select it.</w:t>
+        <w:t>The screening task is: observe the first 40% of a mission's trajectory and decide whether to abort. Splits are 70/15/15 by mission, deterministic in (n, seed), and shared by every experiment through a single definition (src/ml/splits.py) so that no model is evaluated on data used to select it. To ensure complete external reproducibility, the dataset is structured as a full 71 GB parquet telemetry table alongside a compact, stand-alone 500 MB per-planet .npz benchmark release (holding float64 sequences and ground-truth outcome labels).</w:t>
       </w:r>
     </w:p>
     <w:p>

</xml_diff>